<commit_message>
Shorten the AI-use statement in the preprint
Co-Authored-By: Claude Opus 5.5 <noreply@anthropic.com>
Claude-Session: https://claude.ai/code/session_013QUaKdwn81QfzS15QgYsr2
</commit_message>
<xml_diff>
--- a/report/Ostriagin_2026_Tura_flood_Tyumen.docx
+++ b/report/Ostriagin_2026_Tura_flood_Tyumen.docx
@@ -4242,7 +4242,7 @@
       <w:pPr>
         <w:spacing w:after="200"/>
       </w:pPr>
-      <w:hyperlink w:history="1" r:id="rIdfyjpfwjsunb8g5yd929yz">
+      <w:hyperlink w:history="1" r:id="rIdgjzvjcg09ygtyniriaxcc">
         <w:r>
           <w:rPr>
             <w:color w:val="000000"/>
@@ -4391,7 +4391,7 @@
         <w:t xml:space="preserve">Use of AI tools.</w:t>
       </w:r>
       <w:r>
-        <w:t xml:space="preserve"> AI tools assisted with parts of this work, including locating sources, the processing code and editing the text. The author checked the results against the data and sources cited and takes full responsibility for the content.</w:t>
+        <w:t xml:space="preserve"> AI tools assisted with parts of this work, including locating sources and the processing code.</w:t>
       </w:r>
     </w:p>
     <w:p>

</xml_diff>

<commit_message>
Report: full author name, archive version for Zenodo
Co-Authored-By: Claude Opus 5.5 <noreply@anthropic.com>
Claude-Session: https://claude.ai/code/session_013QUaKdwn81QfzS15QgYsr2
</commit_message>
<xml_diff>
--- a/report/Ostriagin_2026_Tura_flood_Tyumen.docx
+++ b/report/Ostriagin_2026_Tura_flood_Tyumen.docx
@@ -15,7 +15,7 @@
           <w:sz w:val="20"/>
           <w:szCs w:val="20"/>
         </w:rPr>
-        <w:t xml:space="preserve">NON-PEER REVIEWED PREPRINT SUBMITTED TO EARTHARXIV</w:t>
+        <w:t xml:space="preserve">RESEARCH REPORT</w:t>
       </w:r>
     </w:p>
     <w:p>
@@ -119,7 +119,7 @@
           <w:sz w:val="28"/>
           <w:szCs w:val="28"/>
         </w:rPr>
-        <w:t xml:space="preserve">Sasha Ostriagin</w:t>
+        <w:t xml:space="preserve">Aleksandr Ostriagin</w:t>
       </w:r>
     </w:p>
     <w:p>
@@ -180,14 +180,7 @@
         <w:spacing w:after="0"/>
       </w:pPr>
       <w:r>
-        <w:rPr>
-          <w:b/>
-          <w:bCs/>
-        </w:rPr>
-        <w:t xml:space="preserve">This manuscript is a non-peer reviewed preprint submitted to EarthArXiv.</w:t>
-      </w:r>
-      <w:r>
-        <w:t xml:space="preserve"> It has not been submitted to a journal. Subsequent versions may differ.</w:t>
+        <w:t xml:space="preserve">This report has not been peer reviewed. Data and code: https://github.com/ostriagin/tura-flood-tyumen-2026</w:t>
       </w:r>
     </w:p>
     <w:p>
@@ -4242,7 +4235,7 @@
       <w:pPr>
         <w:spacing w:after="200"/>
       </w:pPr>
-      <w:hyperlink w:history="1" r:id="rIdgjzvjcg09ygtyniriaxcc">
+      <w:hyperlink w:history="1" r:id="rIdxgvbfqcbsk0ppirogjia5">
         <w:r>
           <w:rPr>
             <w:color w:val="000000"/>
@@ -4694,7 +4687,7 @@
         <w:sz w:val="17"/>
         <w:szCs w:val="17"/>
       </w:rPr>
-      <w:t xml:space="preserve">Non-peer reviewed preprint submitted to EarthArXiv  ·  Ostriagin (2026)  ·  </w:t>
+      <w:t xml:space="preserve">Ostriagin (2026)  ·  Built on the High Bank  ·  </w:t>
     </w:r>
     <w:r>
       <w:rPr>

</xml_diff>